<commit_message>
Merged PR 716: State management rules for Standard Versions
</commit_message>
<xml_diff>
--- a/documents/Nexus-DEB-Workflow-Validation-SideEffects-Guide.docx
+++ b/documents/Nexus-DEB-Workflow-Validation-SideEffects-Guide.docx
@@ -169,12 +169,6 @@
         <w:gridCol w:w="3680"/>
       </w:tblGrid>
       <w:tr>
-        <w:tblPrEx>
-          <w:tblCellMar>
-            <w:top w:w="0" w:type="dxa"/>
-            <w:bottom w:w="0" w:type="dxa"/>
-          </w:tblCellMar>
-        </w:tblPrEx>
         <w:tc>
           <w:tcPr>
             <w:tcW w:w="2000" w:type="dxa"/>
@@ -261,12 +255,6 @@
         </w:tc>
       </w:tr>
       <w:tr>
-        <w:tblPrEx>
-          <w:tblCellMar>
-            <w:top w:w="0" w:type="dxa"/>
-            <w:bottom w:w="0" w:type="dxa"/>
-          </w:tblCellMar>
-        </w:tblPrEx>
         <w:tc>
           <w:tcPr>
             <w:tcW w:w="2000" w:type="dxa"/>
@@ -347,12 +335,6 @@
         </w:tc>
       </w:tr>
       <w:tr>
-        <w:tblPrEx>
-          <w:tblCellMar>
-            <w:top w:w="0" w:type="dxa"/>
-            <w:bottom w:w="0" w:type="dxa"/>
-          </w:tblCellMar>
-        </w:tblPrEx>
         <w:tc>
           <w:tcPr>
             <w:tcW w:w="2000" w:type="dxa"/>
@@ -436,12 +418,6 @@
         </w:tc>
       </w:tr>
       <w:tr>
-        <w:tblPrEx>
-          <w:tblCellMar>
-            <w:top w:w="0" w:type="dxa"/>
-            <w:bottom w:w="0" w:type="dxa"/>
-          </w:tblCellMar>
-        </w:tblPrEx>
         <w:tc>
           <w:tcPr>
             <w:tcW w:w="2000" w:type="dxa"/>
@@ -522,12 +498,6 @@
         </w:tc>
       </w:tr>
       <w:tr>
-        <w:tblPrEx>
-          <w:tblCellMar>
-            <w:top w:w="0" w:type="dxa"/>
-            <w:bottom w:w="0" w:type="dxa"/>
-          </w:tblCellMar>
-        </w:tblPrEx>
         <w:tc>
           <w:tcPr>
             <w:tcW w:w="2000" w:type="dxa"/>
@@ -647,12 +617,6 @@
         </w:tc>
       </w:tr>
       <w:tr>
-        <w:tblPrEx>
-          <w:tblCellMar>
-            <w:top w:w="0" w:type="dxa"/>
-            <w:bottom w:w="0" w:type="dxa"/>
-          </w:tblCellMar>
-        </w:tblPrEx>
         <w:tc>
           <w:tcPr>
             <w:tcW w:w="2000" w:type="dxa"/>
@@ -733,12 +697,6 @@
         </w:tc>
       </w:tr>
       <w:tr>
-        <w:tblPrEx>
-          <w:tblCellMar>
-            <w:top w:w="0" w:type="dxa"/>
-            <w:bottom w:w="0" w:type="dxa"/>
-          </w:tblCellMar>
-        </w:tblPrEx>
         <w:tc>
           <w:tcPr>
             <w:tcW w:w="2000" w:type="dxa"/>
@@ -826,12 +784,6 @@
         </w:tc>
       </w:tr>
       <w:tr>
-        <w:tblPrEx>
-          <w:tblCellMar>
-            <w:top w:w="0" w:type="dxa"/>
-            <w:bottom w:w="0" w:type="dxa"/>
-          </w:tblCellMar>
-        </w:tblPrEx>
         <w:tc>
           <w:tcPr>
             <w:tcW w:w="2000" w:type="dxa"/>
@@ -1098,12 +1050,6 @@
         <w:gridCol w:w="3862"/>
       </w:tblGrid>
       <w:tr>
-        <w:tblPrEx>
-          <w:tblCellMar>
-            <w:top w:w="0" w:type="dxa"/>
-            <w:bottom w:w="0" w:type="dxa"/>
-          </w:tblCellMar>
-        </w:tblPrEx>
         <w:tc>
           <w:tcPr>
             <w:tcW w:w="2200" w:type="dxa"/>
@@ -1190,12 +1136,6 @@
         </w:tc>
       </w:tr>
       <w:tr>
-        <w:tblPrEx>
-          <w:tblCellMar>
-            <w:top w:w="0" w:type="dxa"/>
-            <w:bottom w:w="0" w:type="dxa"/>
-          </w:tblCellMar>
-        </w:tblPrEx>
         <w:tc>
           <w:tcPr>
             <w:tcW w:w="2200" w:type="dxa"/>
@@ -1288,12 +1228,6 @@
         </w:tc>
       </w:tr>
       <w:tr>
-        <w:tblPrEx>
-          <w:tblCellMar>
-            <w:top w:w="0" w:type="dxa"/>
-            <w:bottom w:w="0" w:type="dxa"/>
-          </w:tblCellMar>
-        </w:tblPrEx>
         <w:tc>
           <w:tcPr>
             <w:tcW w:w="2200" w:type="dxa"/>
@@ -1396,12 +1330,6 @@
         </w:tc>
       </w:tr>
       <w:tr>
-        <w:tblPrEx>
-          <w:tblCellMar>
-            <w:top w:w="0" w:type="dxa"/>
-            <w:bottom w:w="0" w:type="dxa"/>
-          </w:tblCellMar>
-        </w:tblPrEx>
         <w:tc>
           <w:tcPr>
             <w:tcW w:w="2200" w:type="dxa"/>
@@ -1494,12 +1422,6 @@
         </w:tc>
       </w:tr>
       <w:tr>
-        <w:tblPrEx>
-          <w:tblCellMar>
-            <w:top w:w="0" w:type="dxa"/>
-            <w:bottom w:w="0" w:type="dxa"/>
-          </w:tblCellMar>
-        </w:tblPrEx>
         <w:tc>
           <w:tcPr>
             <w:tcW w:w="2200" w:type="dxa"/>
@@ -1596,12 +1518,6 @@
         </w:tc>
       </w:tr>
       <w:tr>
-        <w:tblPrEx>
-          <w:tblCellMar>
-            <w:top w:w="0" w:type="dxa"/>
-            <w:bottom w:w="0" w:type="dxa"/>
-          </w:tblCellMar>
-        </w:tblPrEx>
         <w:tc>
           <w:tcPr>
             <w:tcW w:w="2200" w:type="dxa"/>
@@ -1685,12 +1601,6 @@
         </w:tc>
       </w:tr>
       <w:tr>
-        <w:tblPrEx>
-          <w:tblCellMar>
-            <w:top w:w="0" w:type="dxa"/>
-            <w:bottom w:w="0" w:type="dxa"/>
-          </w:tblCellMar>
-        </w:tblPrEx>
         <w:tc>
           <w:tcPr>
             <w:tcW w:w="2200" w:type="dxa"/>
@@ -1793,12 +1703,6 @@
         </w:tc>
       </w:tr>
       <w:tr>
-        <w:tblPrEx>
-          <w:tblCellMar>
-            <w:top w:w="0" w:type="dxa"/>
-            <w:bottom w:w="0" w:type="dxa"/>
-          </w:tblCellMar>
-        </w:tblPrEx>
         <w:tc>
           <w:tcPr>
             <w:tcW w:w="2200" w:type="dxa"/>
@@ -1882,12 +1786,6 @@
         </w:tc>
       </w:tr>
       <w:tr>
-        <w:tblPrEx>
-          <w:tblCellMar>
-            <w:top w:w="0" w:type="dxa"/>
-            <w:bottom w:w="0" w:type="dxa"/>
-          </w:tblCellMar>
-        </w:tblPrEx>
         <w:tc>
           <w:tcPr>
             <w:tcW w:w="2200" w:type="dxa"/>
@@ -1974,12 +1872,6 @@
         </w:tc>
       </w:tr>
       <w:tr>
-        <w:tblPrEx>
-          <w:tblCellMar>
-            <w:top w:w="0" w:type="dxa"/>
-            <w:bottom w:w="0" w:type="dxa"/>
-          </w:tblCellMar>
-        </w:tblPrEx>
         <w:tc>
           <w:tcPr>
             <w:tcW w:w="2200" w:type="dxa"/>
@@ -2063,12 +1955,6 @@
         </w:tc>
       </w:tr>
       <w:tr>
-        <w:tblPrEx>
-          <w:tblCellMar>
-            <w:top w:w="0" w:type="dxa"/>
-            <w:bottom w:w="0" w:type="dxa"/>
-          </w:tblCellMar>
-        </w:tblPrEx>
         <w:tc>
           <w:tcPr>
             <w:tcW w:w="2200" w:type="dxa"/>
@@ -5575,18 +5461,8 @@
           <w:sz w:val="18"/>
           <w:szCs w:val="18"/>
         </w:rPr>
-        <w:t xml:space="preserve">(new </w:t>
-      </w:r>
-      <w:proofErr w:type="spellStart"/>
-      <w:r>
-        <w:rPr>
-          <w:rFonts w:ascii="Courier New" w:eastAsia="Courier New" w:hAnsi="Courier New" w:cs="Courier New"/>
-          <w:sz w:val="18"/>
-          <w:szCs w:val="18"/>
-        </w:rPr>
-        <w:t>ValidationError</w:t>
-      </w:r>
-      <w:proofErr w:type="spellEnd"/>
+        <w:t>(new ValidationError</w:t>
+      </w:r>
     </w:p>
     <w:p>
       <w:pPr>
@@ -5999,7 +5875,10 @@
       </w:r>
       <w:proofErr w:type="spellStart"/>
       <w:r>
-        <w:t>MUTTags</w:t>
+        <w:t>MUT</w:t>
+      </w:r>
+      <w:r>
+        <w:t>Handler</w:t>
       </w:r>
       <w:proofErr w:type="spellEnd"/>
       <w:r>
@@ -7448,7 +7327,10 @@
       </w:r>
       <w:proofErr w:type="spellStart"/>
       <w:r>
-        <w:t>MUTHandler</w:t>
+        <w:t>MUT</w:t>
+      </w:r>
+      <w:r>
+        <w:t>Tags</w:t>
       </w:r>
       <w:proofErr w:type="spellEnd"/>
       <w:r>
@@ -7528,12 +7410,6 @@
         <w:gridCol w:w="6760"/>
       </w:tblGrid>
       <w:tr>
-        <w:tblPrEx>
-          <w:tblCellMar>
-            <w:top w:w="0" w:type="dxa"/>
-            <w:bottom w:w="0" w:type="dxa"/>
-          </w:tblCellMar>
-        </w:tblPrEx>
         <w:tc>
           <w:tcPr>
             <w:tcW w:w="2600" w:type="dxa"/>
@@ -7592,12 +7468,6 @@
         </w:tc>
       </w:tr>
       <w:tr>
-        <w:tblPrEx>
-          <w:tblCellMar>
-            <w:top w:w="0" w:type="dxa"/>
-            <w:bottom w:w="0" w:type="dxa"/>
-          </w:tblCellMar>
-        </w:tblPrEx>
         <w:tc>
           <w:tcPr>
             <w:tcW w:w="2600" w:type="dxa"/>
@@ -7657,7 +7527,14 @@
                 <w:sz w:val="20"/>
                 <w:szCs w:val="20"/>
               </w:rPr>
-              <w:t>MUTTags</w:t>
+              <w:t>MUT</w:t>
+            </w:r>
+            <w:r>
+              <w:rPr>
+                <w:sz w:val="20"/>
+                <w:szCs w:val="20"/>
+              </w:rPr>
+              <w:t>Handler</w:t>
             </w:r>
             <w:proofErr w:type="spellEnd"/>
             <w:r>
@@ -7687,12 +7564,6 @@
         </w:tc>
       </w:tr>
       <w:tr>
-        <w:tblPrEx>
-          <w:tblCellMar>
-            <w:top w:w="0" w:type="dxa"/>
-            <w:bottom w:w="0" w:type="dxa"/>
-          </w:tblCellMar>
-        </w:tblPrEx>
         <w:tc>
           <w:tcPr>
             <w:tcW w:w="2600" w:type="dxa"/>
@@ -7754,7 +7625,14 @@
                 <w:sz w:val="20"/>
                 <w:szCs w:val="20"/>
               </w:rPr>
-              <w:t>MUTHandler</w:t>
+              <w:t>MUT</w:t>
+            </w:r>
+            <w:r>
+              <w:rPr>
+                <w:sz w:val="20"/>
+                <w:szCs w:val="20"/>
+              </w:rPr>
+              <w:t>Tags</w:t>
             </w:r>
             <w:proofErr w:type="spellEnd"/>
             <w:r>
@@ -7884,12 +7762,6 @@
         <w:gridCol w:w="7222"/>
       </w:tblGrid>
       <w:tr>
-        <w:tblPrEx>
-          <w:tblCellMar>
-            <w:top w:w="0" w:type="dxa"/>
-            <w:bottom w:w="0" w:type="dxa"/>
-          </w:tblCellMar>
-        </w:tblPrEx>
         <w:tc>
           <w:tcPr>
             <w:tcW w:w="3200" w:type="dxa"/>
@@ -7948,12 +7820,6 @@
         </w:tc>
       </w:tr>
       <w:tr>
-        <w:tblPrEx>
-          <w:tblCellMar>
-            <w:top w:w="0" w:type="dxa"/>
-            <w:bottom w:w="0" w:type="dxa"/>
-          </w:tblCellMar>
-        </w:tblPrEx>
         <w:tc>
           <w:tcPr>
             <w:tcW w:w="3200" w:type="dxa"/>
@@ -8019,12 +7885,6 @@
         </w:tc>
       </w:tr>
       <w:tr>
-        <w:tblPrEx>
-          <w:tblCellMar>
-            <w:top w:w="0" w:type="dxa"/>
-            <w:bottom w:w="0" w:type="dxa"/>
-          </w:tblCellMar>
-        </w:tblPrEx>
         <w:tc>
           <w:tcPr>
             <w:tcW w:w="3200" w:type="dxa"/>
@@ -8092,12 +7952,6 @@
         </w:tc>
       </w:tr>
       <w:tr>
-        <w:tblPrEx>
-          <w:tblCellMar>
-            <w:top w:w="0" w:type="dxa"/>
-            <w:bottom w:w="0" w:type="dxa"/>
-          </w:tblCellMar>
-        </w:tblPrEx>
         <w:tc>
           <w:tcPr>
             <w:tcW w:w="3200" w:type="dxa"/>
@@ -8163,12 +8017,6 @@
         </w:tc>
       </w:tr>
       <w:tr>
-        <w:tblPrEx>
-          <w:tblCellMar>
-            <w:top w:w="0" w:type="dxa"/>
-            <w:bottom w:w="0" w:type="dxa"/>
-          </w:tblCellMar>
-        </w:tblPrEx>
         <w:tc>
           <w:tcPr>
             <w:tcW w:w="3200" w:type="dxa"/>
@@ -8236,12 +8084,6 @@
         </w:tc>
       </w:tr>
       <w:tr>
-        <w:tblPrEx>
-          <w:tblCellMar>
-            <w:top w:w="0" w:type="dxa"/>
-            <w:bottom w:w="0" w:type="dxa"/>
-          </w:tblCellMar>
-        </w:tblPrEx>
         <w:tc>
           <w:tcPr>
             <w:tcW w:w="3200" w:type="dxa"/>
@@ -8297,12 +8139,6 @@
         </w:tc>
       </w:tr>
       <w:tr>
-        <w:tblPrEx>
-          <w:tblCellMar>
-            <w:top w:w="0" w:type="dxa"/>
-            <w:bottom w:w="0" w:type="dxa"/>
-          </w:tblCellMar>
-        </w:tblPrEx>
         <w:tc>
           <w:tcPr>
             <w:tcW w:w="3200" w:type="dxa"/>
@@ -8360,12 +8196,6 @@
         </w:tc>
       </w:tr>
       <w:tr>
-        <w:tblPrEx>
-          <w:tblCellMar>
-            <w:top w:w="0" w:type="dxa"/>
-            <w:bottom w:w="0" w:type="dxa"/>
-          </w:tblCellMar>
-        </w:tblPrEx>
         <w:tc>
           <w:tcPr>
             <w:tcW w:w="3200" w:type="dxa"/>
@@ -8431,12 +8261,6 @@
         </w:tc>
       </w:tr>
       <w:tr>
-        <w:tblPrEx>
-          <w:tblCellMar>
-            <w:top w:w="0" w:type="dxa"/>
-            <w:bottom w:w="0" w:type="dxa"/>
-          </w:tblCellMar>
-        </w:tblPrEx>
         <w:tc>
           <w:tcPr>
             <w:tcW w:w="3200" w:type="dxa"/>
@@ -8520,12 +8344,6 @@
         </w:tc>
       </w:tr>
       <w:tr>
-        <w:tblPrEx>
-          <w:tblCellMar>
-            <w:top w:w="0" w:type="dxa"/>
-            <w:bottom w:w="0" w:type="dxa"/>
-          </w:tblCellMar>
-        </w:tblPrEx>
         <w:tc>
           <w:tcPr>
             <w:tcW w:w="3200" w:type="dxa"/>
@@ -8607,12 +8425,6 @@
         </w:tc>
       </w:tr>
       <w:tr>
-        <w:tblPrEx>
-          <w:tblCellMar>
-            <w:top w:w="0" w:type="dxa"/>
-            <w:bottom w:w="0" w:type="dxa"/>
-          </w:tblCellMar>
-        </w:tblPrEx>
         <w:tc>
           <w:tcPr>
             <w:tcW w:w="3200" w:type="dxa"/>
@@ -8680,12 +8492,6 @@
         </w:tc>
       </w:tr>
       <w:tr>
-        <w:tblPrEx>
-          <w:tblCellMar>
-            <w:top w:w="0" w:type="dxa"/>
-            <w:bottom w:w="0" w:type="dxa"/>
-          </w:tblCellMar>
-        </w:tblPrEx>
         <w:tc>
           <w:tcPr>
             <w:tcW w:w="3200" w:type="dxa"/>
@@ -8751,12 +8557,6 @@
         </w:tc>
       </w:tr>
       <w:tr>
-        <w:tblPrEx>
-          <w:tblCellMar>
-            <w:top w:w="0" w:type="dxa"/>
-            <w:bottom w:w="0" w:type="dxa"/>
-          </w:tblCellMar>
-        </w:tblPrEx>
         <w:tc>
           <w:tcPr>
             <w:tcW w:w="3200" w:type="dxa"/>
@@ -8814,12 +8614,6 @@
         </w:tc>
       </w:tr>
       <w:tr>
-        <w:tblPrEx>
-          <w:tblCellMar>
-            <w:top w:w="0" w:type="dxa"/>
-            <w:bottom w:w="0" w:type="dxa"/>
-          </w:tblCellMar>
-        </w:tblPrEx>
         <w:tc>
           <w:tcPr>
             <w:tcW w:w="3200" w:type="dxa"/>
@@ -8893,12 +8687,6 @@
         </w:tc>
       </w:tr>
       <w:tr>
-        <w:tblPrEx>
-          <w:tblCellMar>
-            <w:top w:w="0" w:type="dxa"/>
-            <w:bottom w:w="0" w:type="dxa"/>
-          </w:tblCellMar>
-        </w:tblPrEx>
         <w:tc>
           <w:tcPr>
             <w:tcW w:w="3200" w:type="dxa"/>
@@ -8966,12 +8754,6 @@
         </w:tc>
       </w:tr>
       <w:tr>
-        <w:tblPrEx>
-          <w:tblCellMar>
-            <w:top w:w="0" w:type="dxa"/>
-            <w:bottom w:w="0" w:type="dxa"/>
-          </w:tblCellMar>
-        </w:tblPrEx>
         <w:tc>
           <w:tcPr>
             <w:tcW w:w="3200" w:type="dxa"/>
@@ -9037,12 +8819,6 @@
         </w:tc>
       </w:tr>
       <w:tr>
-        <w:tblPrEx>
-          <w:tblCellMar>
-            <w:top w:w="0" w:type="dxa"/>
-            <w:bottom w:w="0" w:type="dxa"/>
-          </w:tblCellMar>
-        </w:tblPrEx>
         <w:tc>
           <w:tcPr>
             <w:tcW w:w="3200" w:type="dxa"/>
@@ -9110,12 +8886,6 @@
         </w:tc>
       </w:tr>
       <w:tr>
-        <w:tblPrEx>
-          <w:tblCellMar>
-            <w:top w:w="0" w:type="dxa"/>
-            <w:bottom w:w="0" w:type="dxa"/>
-          </w:tblCellMar>
-        </w:tblPrEx>
         <w:tc>
           <w:tcPr>
             <w:tcW w:w="3200" w:type="dxa"/>
@@ -11170,6 +10940,7 @@
   <w:style w:type="character" w:default="1" w:styleId="DefaultParagraphFont">
     <w:name w:val="Default Paragraph Font"/>
     <w:uiPriority w:val="1"/>
+    <w:semiHidden/>
     <w:unhideWhenUsed/>
   </w:style>
   <w:style w:type="table" w:default="1" w:styleId="TableNormal">

</xml_diff>